<commit_message>
docs(prospection): plus aucune question sur la clientele du vendeur
La question "vous travaillez avec des societes ?" avait ete gardee comme
exception, au motif qu'elle portait sur un type de client et non sur son
portefeuille. Elle tombe aussi : le test n'est pas la formulation, c'est
le sujet.

- la decouverte demarre directement sur le stock, sans question
  prealable sur ses clients
- l'encadre 4.3 liste la question parmi les interdits et explique ce qui
  la remplace : ce qu'on veut savoir de sa clientele, il le dit de
  lui-meme en parlant de son stock et de ses impayes
- accroche flotte (5.2) : son declencheur devient une mention spontanee
  du vendeur, et sa relance ne compte plus ses clients
  ("elles vous demandent quoi ?" au lieu de "vous en servez combien ?")

DOCX et PDF regeneres.

Co-Authored-By: Claude Opus 5 <noreply@anthropic.com>
</commit_message>
<xml_diff>
--- a/docs/guide-prospection-vendeurs-2026-08.docx
+++ b/docs/guide-prospection-vendeurs-2026-08.docx
@@ -1534,23 +1534,23 @@
         <w:pStyle w:val="BodyText"/>
       </w:pPr>
       <w:r>
-        <w:t xml:space="preserve">Puis une seule question avant d’entrer dans le stock, celle qui ouvre la porte de l’offre flotte :</w:t>
-      </w:r>
-    </w:p>
-    <w:p>
-      <w:pPr>
-        <w:pStyle w:val="BlockText"/>
-      </w:pPr>
-      <w:r>
-        <w:t xml:space="preserve">« Vous travaillez avec des sociétés ? Des transporteurs, des taxis, des entreprises qui ont des véhicules ? »</w:t>
-      </w:r>
-    </w:p>
-    <w:p>
-      <w:pPr>
-        <w:pStyle w:val="FirstParagraph"/>
-      </w:pPr>
-      <w:r>
-        <w:t xml:space="preserve">S’il dit oui, on le note et on y revient à l’argumentaire (accroche « flottes », section 5). On n’enchaîne pas dessus maintenant.</w:t>
+        <w:t xml:space="preserve">On enchaîne directement sur le stock (bloc 1).</w:t>
+      </w:r>
+      <w:r>
+        <w:t xml:space="preserve"> </w:t>
+      </w:r>
+      <w:r>
+        <w:rPr>
+          <w:b/>
+          <w:bCs/>
+        </w:rPr>
+        <w:t xml:space="preserve">Aucune question sur ses clients</w:t>
+      </w:r>
+      <w:r>
+        <w:t xml:space="preserve"> </w:t>
+      </w:r>
+      <w:r>
+        <w:t xml:space="preserve">ne vient avant.</w:t>
       </w:r>
     </w:p>
     <w:p>
@@ -1566,7 +1566,7 @@
         <w:pStyle w:val="BodyText"/>
       </w:pPr>
       <w:r>
-        <w:t xml:space="preserve">Pas de « depuis quand vous êtes installés », pas de « qui sont vos clients », pas de « combien vous en servez par jour », pas de « d’où viennent vos nouveaux clients ». En Côte d’Ivoire, ces questions-là, posées par un inconnu qui entre dans un magasin,</w:t>
+        <w:t xml:space="preserve">Pas de « depuis quand vous êtes installés », pas de « qui sont vos clients », pas de « combien vous en servez par jour », pas de « d’où viennent vos nouveaux clients », pas de « vous travaillez avec des sociétés ». En Côte d’Ivoire, ces questions-là, posées par un inconnu qui entre dans un magasin,</w:t>
       </w:r>
       <w:r>
         <w:t xml:space="preserve"> </w:t>
@@ -1586,19 +1586,19 @@
         <w:pStyle w:val="BodyText"/>
       </w:pPr>
       <w:r>
-        <w:t xml:space="preserve">La seule exception est la question ci-dessus sur les sociétés, parce qu’elle porte sur un</w:t>
-      </w:r>
-      <w:r>
-        <w:t xml:space="preserve"> </w:t>
-      </w:r>
-      <w:r>
-        <w:t xml:space="preserve">type</w:t>
-      </w:r>
-      <w:r>
-        <w:t xml:space="preserve"> </w:t>
-      </w:r>
-      <w:r>
-        <w:t xml:space="preserve">de client, pas sur les siens, et qu’elle ouvre une offre concrète. Si elle passe mal, on l’abandonne aussi.</w:t>
+        <w:t xml:space="preserve">Ce qu’on veut savoir de sa clientèle,</w:t>
+      </w:r>
+      <w:r>
+        <w:t xml:space="preserve"> </w:t>
+      </w:r>
+      <w:r>
+        <w:t xml:space="preserve">il le dira de lui-même</w:t>
+      </w:r>
+      <w:r>
+        <w:t xml:space="preserve"> </w:t>
+      </w:r>
+      <w:r>
+        <w:t xml:space="preserve">en parlant de son stock : qui lui prend telle pièce, pour quels véhicules, qui lui doit de l’argent. On écoute, on note, on ne demande pas.</w:t>
       </w:r>
     </w:p>
     <w:bookmarkEnd w:id="25"/>
@@ -2910,7 +2910,7 @@
           <w:i/>
           <w:iCs/>
         </w:rPr>
-        <w:t xml:space="preserve">il a dit oui à la question sociétés, en 4.3</w:t>
+        <w:t xml:space="preserve">il a mentionné de lui-même des sociétés, des taxis ou des transporteurs ; on ne le lui a pas demandé</w:t>
       </w:r>
     </w:p>
     <w:p>
@@ -2936,7 +2936,7 @@
         <w:t xml:space="preserve"> </w:t>
       </w:r>
       <w:r>
-        <w:t xml:space="preserve">« Vous en servez combien aujourd’hui, de sociétés comme ça ? »</w:t>
+        <w:t xml:space="preserve">« Ces sociétés-là, elles vous demandent quoi le plus souvent ? »</w:t>
       </w:r>
     </w:p>
     <w:p>

</xml_diff>

<commit_message>
docs(prospection): fusionne les deux questions sur la vente en ligne
Depuis que "vendez-vous deja en ligne ?" est posee au present, la
question suivante sur Facebook et WhatsApp Business faisait doublon :
les deux lignes attendaient le meme signal.

Les canaux deviennent des exemples dans la question unique. Le bloc 3
passe a 3 questions, la trame a 21.

DOCX et PDF regeneres.

Co-Authored-By: Claude Opus 5 <noreply@anthropic.com>
</commit_message>
<xml_diff>
--- a/docs/guide-prospection-vendeurs-2026-08.docx
+++ b/docs/guide-prospection-vendeurs-2026-08.docx
@@ -2103,42 +2103,18 @@
               <w:pStyle w:val="Compact"/>
             </w:pPr>
             <w:r>
-              <w:t xml:space="preserve">« Est-ce que vous vendez déjà en ligne ? Et comment ça se passe ? »</w:t>
-            </w:r>
-          </w:p>
-        </w:tc>
-        <w:tc>
-          <w:tcPr/>
-          <w:p>
-            <w:pPr>
-              <w:pStyle w:val="Compact"/>
-            </w:pPr>
-            <w:r>
-              <w:t xml:space="preserve">On demande au présent, sans supposer un échec : un vendeur actif en ligne comprendra la proposition en deux minutes, un vendeur déçu formule une objection qu’on traite tout de suite plutôt qu’au closing</w:t>
-            </w:r>
-          </w:p>
-        </w:tc>
-      </w:tr>
-      <w:tr>
-        <w:tc>
-          <w:tcPr/>
-          <w:p>
-            <w:pPr>
-              <w:pStyle w:val="Compact"/>
-            </w:pPr>
-            <w:r>
-              <w:t xml:space="preserve">« Vous avez une page Facebook, un WhatsApp Business ? »</w:t>
-            </w:r>
-          </w:p>
-        </w:tc>
-        <w:tc>
-          <w:tcPr/>
-          <w:p>
-            <w:pPr>
-              <w:pStyle w:val="Compact"/>
-            </w:pPr>
-            <w:r>
-              <w:t xml:space="preserve">Un vendeur déjà en ligne comprend la proposition en deux minutes</w:t>
+              <w:t xml:space="preserve">« Est-ce que vous vendez déjà en ligne — Facebook, WhatsApp Business ? Et comment ça se passe ? »</w:t>
+            </w:r>
+          </w:p>
+        </w:tc>
+        <w:tc>
+          <w:tcPr/>
+          <w:p>
+            <w:pPr>
+              <w:pStyle w:val="Compact"/>
+            </w:pPr>
+            <w:r>
+              <w:t xml:space="preserve">On demande au présent, sans supposer un échec. Un vendeur actif en ligne comprendra la proposition en deux minutes ; un vendeur déçu formule une objection qu’on traite tout de suite plutôt qu’au closing</w:t>
             </w:r>
           </w:p>
         </w:tc>

</xml_diff>

<commit_message>
feat(prospection): parler de phase de recrutement, jamais d'inactivite
On ne dit plus « nous ne sommes pas encore en activite » au vendeur :
on dit « nous sommes dans la phase de recrutement des vendeurs
professionnels ». Meme realite, formulee comme une selection a laquelle
il a interet a appartenir.

- guide-prospection : accroche 4.1, objection 6.6, contexte de
  prelancement 7 (+ liste explicite des formulations bannies)
- manuel liaison : bonne pratique de recensement reformulee
- PROSPECTION_SCRIPT : accroche et question de cloture alignees

Co-Authored-By: Claude Opus 5 <noreply@anthropic.com>
</commit_message>
<xml_diff>
--- a/docs/guide-prospection-vendeurs-2026-08.docx
+++ b/docs/guide-prospection-vendeurs-2026-08.docx
@@ -1218,23 +1218,23 @@
         <w:t xml:space="preserve">Si on demande « et ça marche déjà ? » dès la porte</w:t>
       </w:r>
       <w:r>
-        <w:t xml:space="preserve">, on répond sans détour et on enchaîne : « Pas encore —</w:t>
-      </w:r>
-      <w:r>
-        <w:t xml:space="preserve"> </w:t>
-      </w:r>
-      <w:r>
-        <w:rPr>
-          <w:b/>
-          <w:bCs/>
-        </w:rPr>
-        <w:t xml:space="preserve">nous ne sommes pas en activité, nous recensons d’abord les vendeurs professionnels.</w:t>
-      </w:r>
-      <w:r>
-        <w:t xml:space="preserve"> </w:t>
-      </w:r>
-      <w:r>
-        <w:t xml:space="preserve">Ceux qui seront présents au lancement auront un nouveau canal de distribution pour vendre plus. C’est pour ça que je passe vous voir. » Puis on bascule en découverte (4.3). Le développement complet est en 6.6.</w:t>
+        <w:t xml:space="preserve">, on répond sans détour et on enchaîne : «</w:t>
+      </w:r>
+      <w:r>
+        <w:t xml:space="preserve"> </w:t>
+      </w:r>
+      <w:r>
+        <w:rPr>
+          <w:b/>
+          <w:bCs/>
+        </w:rPr>
+        <w:t xml:space="preserve">Nous sommes dans la phase de recrutement des vendeurs professionnels</w:t>
+      </w:r>
+      <w:r>
+        <w:t xml:space="preserve"> </w:t>
+      </w:r>
+      <w:r>
+        <w:t xml:space="preserve">— c’est pour ça que je passe vous voir. Ceux qui seront présents au lancement auront un nouveau canal de distribution pour vendre plus. » Puis on bascule en découverte (4.3). Le développement complet est en 6.6.</w:t>
       </w:r>
     </w:p>
     <w:bookmarkEnd w:id="23"/>
@@ -3944,23 +3944,36 @@
         <w:pStyle w:val="BlockText"/>
       </w:pPr>
       <w:r>
-        <w:t xml:space="preserve">« C’est vrai, et je vous le dis franchement :</w:t>
-      </w:r>
-      <w:r>
-        <w:t xml:space="preserve"> </w:t>
-      </w:r>
-      <w:r>
-        <w:rPr>
-          <w:b/>
-          <w:bCs/>
-        </w:rPr>
-        <w:t xml:space="preserve">nous ne sommes pas encore en activité.</w:t>
-      </w:r>
-      <w:r>
-        <w:t xml:space="preserve"> </w:t>
-      </w:r>
-      <w:r>
-        <w:t xml:space="preserve">Aujourd’hui, nous recensons les vendeurs professionnels de la place, un par un — c’est pour ça que je suis dans votre magasin. Ceux qui seront présents au lancement auront</w:t>
+        <w:t xml:space="preserve">« C’est vrai, et c’est exactement pour ça que je suis dans votre magasin aujourd’hui :</w:t>
+      </w:r>
+      <w:r>
+        <w:t xml:space="preserve"> </w:t>
+      </w:r>
+      <w:r>
+        <w:rPr>
+          <w:b/>
+          <w:bCs/>
+        </w:rPr>
+        <w:t xml:space="preserve">nous sommes dans la phase de recrutement des vendeurs professionnels</w:t>
+      </w:r>
+      <w:r>
+        <w:t xml:space="preserve">, et</w:t>
+      </w:r>
+      <w:r>
+        <w:t xml:space="preserve"> </w:t>
+      </w:r>
+      <w:r>
+        <w:rPr>
+          <w:b/>
+          <w:bCs/>
+        </w:rPr>
+        <w:t xml:space="preserve">nous ouvrons dans les trente jours.</w:t>
+      </w:r>
+      <w:r>
+        <w:t xml:space="preserve"> </w:t>
+      </w:r>
+      <w:r>
+        <w:t xml:space="preserve">Ceux qui seront présents au lancement auront</w:t>
       </w:r>
       <w:r>
         <w:t xml:space="preserve"> </w:t>
@@ -3994,7 +4007,7 @@
         <w:t xml:space="preserve"> </w:t>
       </w:r>
       <w:r>
-        <w:t xml:space="preserve">« Vous préférez être recensé maintenant, avec tout votre stock, ou attendre de voir la place que les autres auront prise ? »</w:t>
+        <w:t xml:space="preserve">« Vous préférez entrer maintenant, avec tout votre stock, ou attendre de voir la place que les autres auront prise ? »</w:t>
       </w:r>
     </w:p>
     <w:bookmarkEnd w:id="42"/>
@@ -4168,7 +4181,7 @@
           <w:b/>
           <w:bCs/>
         </w:rPr>
-        <w:t xml:space="preserve">Pièces ouvre dans les trente jours, et nous ne sommes pas encore en activité.</w:t>
+        <w:t xml:space="preserve">Pièces ouvre dans les trente jours, et nous sommes dans la phase de recrutement des vendeurs professionnels.</w:t>
       </w:r>
       <w:r>
         <w:t xml:space="preserve"> </w:t>
@@ -4184,7 +4197,7 @@
           <w:b/>
           <w:bCs/>
         </w:rPr>
-        <w:t xml:space="preserve">« nous ne vendons pas encore, nous recensons d’abord les vendeurs professionnels de la place. Ceux qui seront présents auront un nouveau canal de distribution, moderne et efficace, pour augmenter leurs ventes. »</w:t>
+        <w:t xml:space="preserve">« nous sommes dans la phase de recrutement des vendeurs professionnels de la place. Ceux qui seront présents auront un nouveau canal de distribution, moderne et efficace, pour augmenter leurs ventes. »</w:t>
       </w:r>
       <w:r>
         <w:t xml:space="preserve"> </w:t>
@@ -4204,6 +4217,34 @@
       </w:r>
       <w:r>
         <w:t xml:space="preserve">. Deux conséquences directes :</w:t>
+      </w:r>
+    </w:p>
+    <w:p>
+      <w:pPr>
+        <w:pStyle w:val="BodyText"/>
+      </w:pPr>
+      <w:r>
+        <w:rPr>
+          <w:b/>
+          <w:bCs/>
+        </w:rPr>
+        <w:t xml:space="preserve">Ce qu’on ne dit jamais</w:t>
+      </w:r>
+      <w:r>
+        <w:t xml:space="preserve">, même pour être honnête : « nous ne sommes pas encore en activité », « nous ne vendons pas encore », « on démarre à peine ». C’est la même réalité, mais formulée comme une faiblesse, et le commerçant entend « entreprise qui n’existe pas ». On dit</w:t>
+      </w:r>
+      <w:r>
+        <w:t xml:space="preserve"> </w:t>
+      </w:r>
+      <w:r>
+        <w:rPr>
+          <w:b/>
+          <w:bCs/>
+        </w:rPr>
+        <w:t xml:space="preserve">recrutement</w:t>
+      </w:r>
+      <w:r>
+        <w:t xml:space="preserve">, et le vendeur entend une sélection à laquelle il a intérêt à appartenir.</w:t>
       </w:r>
     </w:p>
     <w:p>
@@ -4276,7 +4317,7 @@
           <w:b/>
           <w:bCs/>
         </w:rPr>
-        <w:t xml:space="preserve">On recense tout le stock, pas un échantillon.</w:t>
+        <w:t xml:space="preserve">On met en ligne tout le stock, pas un échantillon.</w:t>
       </w:r>
       <w:r>
         <w:t xml:space="preserve"> </w:t>
@@ -4341,7 +4382,7 @@
         <w:t xml:space="preserve"> </w:t>
       </w:r>
       <w:r>
-        <w:t xml:space="preserve">Pas un échantillon, pas « on commence par quelques pièces pour voir » : on est en phase de recensement, l’agent passe une fois, et ce qu’il n’a pas photographié ce jour-là n’existera pas au lancement. La question de closing se pose donc d’emblée à ce niveau :</w:t>
+        <w:t xml:space="preserve">Pas un échantillon, pas « on commence par quelques pièces pour voir » : nous recrutons les vendeurs pour le lancement, l’agent passe une fois, et ce qu’il n’a pas photographié ce jour-là n’existera pas au lancement. La question de closing se pose donc d’emblée à ce niveau :</w:t>
       </w:r>
     </w:p>
     <w:p>
@@ -4349,7 +4390,7 @@
         <w:pStyle w:val="BlockText"/>
       </w:pPr>
       <w:r>
-        <w:t xml:space="preserve">« On recense</w:t>
+        <w:t xml:space="preserve">« On met</w:t>
       </w:r>
       <w:r>
         <w:t xml:space="preserve"> </w:t>
@@ -4365,7 +4406,7 @@
         <w:t xml:space="preserve"> </w:t>
       </w:r>
       <w:r>
-        <w:t xml:space="preserve">: j’envoie un agent, il reste le temps qu’il faut, il photographie et il décrit rayon par rayon. Le jour de l’ouverture, c’est votre magasin entier qui est en ligne, pas trois pièces. On le fait jeudi ou vendredi ? »</w:t>
+        <w:t xml:space="preserve">en ligne : j’envoie un agent, il reste le temps qu’il faut, il photographie et il décrit rayon par rayon. Le jour de l’ouverture, c’est votre magasin entier qui est en ligne, pas trois pièces. On le fait jeudi ou vendredi ? »</w:t>
       </w:r>
     </w:p>
     <w:p>

</xml_diff>

<commit_message>
fix(prospection): retablir le theme IDENTITE et finir le bloc identite
Le commit precedent a figé un etat intermediaire : la page liaison
referencait le theme IDENTITE que les constantes ne declaraient plus, et
le build web echouait sur cette comparaison sans recouvrement.

Etat coherent : theme IDENTITE declare avec ses questions, export en
place dans constants/index.ts, formulaire de cloture et validateurs
alignes. Build web OK, 22 tests prospection verts.

Co-Authored-By: Claude Opus 5 <noreply@anthropic.com>
</commit_message>
<xml_diff>
--- a/docs/guide-prospection-vendeurs-2026-08.docx
+++ b/docs/guide-prospection-vendeurs-2026-08.docx
@@ -795,7 +795,7 @@
       </w:r>
     </w:p>
     <w:bookmarkEnd w:id="21"/>
-    <w:bookmarkStart w:id="22" w:name="préparer-la-visite"/>
+    <w:bookmarkStart w:id="23" w:name="préparer-la-visite"/>
     <w:p>
       <w:pPr>
         <w:pStyle w:val="Heading2"/>
@@ -900,14 +900,13 @@
         <w:t xml:space="preserve">: demander une référence précise, comme un client. On voit en trois minutes la profondeur du stock, la vitesse à sortir une pièce et l’organisation de la réserve — trois choses que le patron ne dira jamais en mots. Puis on enchaîne sur l’accroche (4.1) : « Je vais être honnête avec vous, je ne suis pas venue que pour ça. Je suis Farida, de Pièces… ». C’est aussi la seule façon utile de sortir d’un magasin où le patron est absent.</w:t>
       </w:r>
     </w:p>
-    <w:bookmarkEnd w:id="22"/>
-    <w:bookmarkStart w:id="32" w:name="X698522ad38752bebab657d2b18e759767239f32"/>
-    <w:p>
-      <w:pPr>
-        <w:pStyle w:val="Heading2"/>
-      </w:pPr>
-      <w:r>
-        <w:t xml:space="preserve">4. Trame d’entretien — ce qu’on dit, mot pour mot</w:t>
+    <w:bookmarkStart w:id="22" w:name="X2be1d3820c4ec63c8792b3927e2770a8533afb9"/>
+    <w:p>
+      <w:pPr>
+        <w:pStyle w:val="Heading3"/>
+      </w:pPr>
+      <w:r>
+        <w:t xml:space="preserve">Avant de parler : s’assurer qu’on est devant le patron</w:t>
       </w:r>
     </w:p>
     <w:p>
@@ -915,50 +914,25 @@
         <w:pStyle w:val="FirstParagraph"/>
       </w:pPr>
       <w:r>
-        <w:t xml:space="preserve">Ce qui suit n’est pas une liste de thèmes à couvrir : ce sont</w:t>
-      </w:r>
-      <w:r>
-        <w:t xml:space="preserve"> </w:t>
-      </w:r>
-      <w:r>
-        <w:rPr>
-          <w:b/>
-          <w:bCs/>
-        </w:rPr>
-        <w:t xml:space="preserve">les phrases telles qu’on les prononce</w:t>
-      </w:r>
-      <w:r>
-        <w:t xml:space="preserve">, dans l’ordre où on les prononce. Les blocs en retrait se disent tels quels. Les tableaux donnent la question à poser à gauche, et à droite ce qu’on écoute dans la réponse.</w:t>
-      </w:r>
-    </w:p>
-    <w:p>
-      <w:pPr>
-        <w:pStyle w:val="BodyText"/>
-      </w:pPr>
-      <w:r>
-        <w:t xml:space="preserve">L’entretien complet tient en</w:t>
-      </w:r>
-      <w:r>
-        <w:t xml:space="preserve"> </w:t>
-      </w:r>
-      <w:r>
-        <w:rPr>
-          <w:b/>
-          <w:bCs/>
-        </w:rPr>
-        <w:t xml:space="preserve">quinze à vingt minutes</w:t>
-      </w:r>
-      <w:r>
-        <w:t xml:space="preserve">, cinq blocs, une vingtaine de questions. On ne les pose jamais toutes : on suit le fil du commerçant, et on note dans la fiche de compte-rendu (section 8).</w:t>
-      </w:r>
-    </w:p>
-    <w:bookmarkStart w:id="23" w:name="laccroche-les-quinze-premières-secondes"/>
-    <w:p>
-      <w:pPr>
-        <w:pStyle w:val="Heading3"/>
-      </w:pPr>
-      <w:r>
-        <w:t xml:space="preserve">4.1 L’accroche — les quinze premières secondes</w:t>
+        <w:rPr>
+          <w:b/>
+          <w:bCs/>
+        </w:rPr>
+        <w:t xml:space="preserve">Ce n’est pas une question de la trame</w:t>
+      </w:r>
+      <w:r>
+        <w:t xml:space="preserve"> </w:t>
+      </w:r>
+      <w:r>
+        <w:t xml:space="preserve">: ça se règle au seuil du magasin, avant l’accroche et avant tout enregistrement. Deux phrases, sur le ton de quelqu’un qui cherche quelqu’un :</w:t>
+      </w:r>
+    </w:p>
+    <w:p>
+      <w:pPr>
+        <w:pStyle w:val="BlockText"/>
+      </w:pPr>
+      <w:r>
+        <w:t xml:space="preserve">« À qui je parle ? » — puis « C’est vous le propriétaire du magasin ? »</w:t>
       </w:r>
     </w:p>
     <w:p>
@@ -966,373 +940,17 @@
         <w:pStyle w:val="FirstParagraph"/>
       </w:pPr>
       <w:r>
-        <w:t xml:space="preserve">On entre, on salue, et on dit ceci</w:t>
-      </w:r>
-      <w:r>
-        <w:t xml:space="preserve"> </w:t>
-      </w:r>
-      <w:r>
-        <w:rPr>
-          <w:b/>
-          <w:bCs/>
-        </w:rPr>
-        <w:t xml:space="preserve">debout, sans sortir le téléphone</w:t>
-      </w:r>
-      <w:r>
-        <w:t xml:space="preserve"> </w:t>
-      </w:r>
-      <w:r>
-        <w:t xml:space="preserve">:</w:t>
-      </w:r>
-    </w:p>
-    <w:p>
-      <w:pPr>
-        <w:pStyle w:val="BlockText"/>
-      </w:pPr>
-      <w:r>
-        <w:t xml:space="preserve">« Bonjour Monsieur. / Bonjour Madame.</w:t>
-      </w:r>
-      <w:r>
-        <w:t xml:space="preserve"> </w:t>
-      </w:r>
-      <w:r>
-        <w:t xml:space="preserve">Je suis</w:t>
-      </w:r>
-      <w:r>
-        <w:t xml:space="preserve"> </w:t>
-      </w:r>
-      <w:r>
-        <w:rPr>
-          <w:b/>
-          <w:bCs/>
-        </w:rPr>
-        <w:t xml:space="preserve">Farida</w:t>
-      </w:r>
-      <w:r>
-        <w:t xml:space="preserve">, de</w:t>
-      </w:r>
-      <w:r>
-        <w:t xml:space="preserve"> </w:t>
-      </w:r>
-      <w:r>
-        <w:rPr>
-          <w:b/>
-          <w:bCs/>
-        </w:rPr>
-        <w:t xml:space="preserve">Pièces</w:t>
-      </w:r>
-      <w:r>
-        <w:t xml:space="preserve"> </w:t>
-      </w:r>
-      <w:r>
-        <w:t xml:space="preserve">— pieces.ci.</w:t>
-      </w:r>
-      <w:r>
-        <w:t xml:space="preserve"> </w:t>
-      </w:r>
-      <w:r>
-        <w:t xml:space="preserve">Nous sommes une plateforme qui met en relation les</w:t>
-      </w:r>
-      <w:r>
-        <w:t xml:space="preserve"> </w:t>
-      </w:r>
-      <w:r>
-        <w:rPr>
-          <w:b/>
-          <w:bCs/>
-        </w:rPr>
-        <w:t xml:space="preserve">vendeurs de pièces</w:t>
-      </w:r>
-      <w:r>
-        <w:t xml:space="preserve"> </w:t>
-      </w:r>
-      <w:r>
-        <w:t xml:space="preserve">et les</w:t>
-      </w:r>
-      <w:r>
-        <w:t xml:space="preserve"> </w:t>
-      </w:r>
-      <w:r>
-        <w:rPr>
-          <w:b/>
-          <w:bCs/>
-        </w:rPr>
-        <w:t xml:space="preserve">acheteurs</w:t>
-      </w:r>
-      <w:r>
-        <w:t xml:space="preserve"> </w:t>
-      </w:r>
-      <w:r>
-        <w:t xml:space="preserve">: entreprises, flottes, professionnels et particuliers.</w:t>
-      </w:r>
-      <w:r>
-        <w:t xml:space="preserve"> </w:t>
-      </w:r>
-      <w:r>
-        <w:t xml:space="preserve">Nous sommes</w:t>
-      </w:r>
-      <w:r>
-        <w:t xml:space="preserve"> </w:t>
-      </w:r>
-      <w:r>
-        <w:rPr>
-          <w:b/>
-          <w:bCs/>
-        </w:rPr>
-        <w:t xml:space="preserve">le Jumia des pièces détachées</w:t>
-      </w:r>
-      <w:r>
-        <w:t xml:space="preserve">. »</w:t>
-      </w:r>
-    </w:p>
-    <w:p>
-      <w:pPr>
-        <w:pStyle w:val="FirstParagraph"/>
-      </w:pPr>
-      <w:r>
-        <w:t xml:space="preserve">Puis</w:t>
-      </w:r>
-      <w:r>
-        <w:t xml:space="preserve"> </w:t>
-      </w:r>
-      <w:r>
-        <w:rPr>
-          <w:b/>
-          <w:bCs/>
-        </w:rPr>
-        <w:t xml:space="preserve">on s’arrête</w:t>
-      </w:r>
-      <w:r>
-        <w:t xml:space="preserve">. On laisse la phrase tomber. C’est la seule pause volontaire de tout l’entretien, et elle fait tout le travail : le commerçant comprend en trois secondes qu’on lui amène des acheteurs, et c’est lui qui relance.</w:t>
-      </w:r>
-    </w:p>
-    <w:p>
-      <w:pPr>
-        <w:pStyle w:val="BodyText"/>
-      </w:pPr>
-      <w:r>
-        <w:t xml:space="preserve">Quelques règles sur cette accroche :</w:t>
-      </w:r>
-    </w:p>
-    <w:p>
-      <w:pPr>
-        <w:pStyle w:val="Compact"/>
-        <w:numPr>
-          <w:ilvl w:val="0"/>
-          <w:numId w:val="1005"/>
-        </w:numPr>
-      </w:pPr>
-      <w:r>
-        <w:rPr>
-          <w:b/>
-          <w:bCs/>
-        </w:rPr>
-        <w:t xml:space="preserve">On donne son prénom, pas une fonction.</w:t>
-      </w:r>
-      <w:r>
-        <w:t xml:space="preserve"> </w:t>
-      </w:r>
-      <w:r>
-        <w:t xml:space="preserve">« Farida de Pièces » passe ; « chargée de développement commercial » ferme la porte.</w:t>
-      </w:r>
-    </w:p>
-    <w:p>
-      <w:pPr>
-        <w:pStyle w:val="Compact"/>
-        <w:numPr>
-          <w:ilvl w:val="0"/>
-          <w:numId w:val="1005"/>
-        </w:numPr>
-      </w:pPr>
-      <w:r>
-        <w:rPr>
-          <w:b/>
-          <w:bCs/>
-        </w:rPr>
-        <w:t xml:space="preserve">On dit « Jumia » sans complexe.</w:t>
-      </w:r>
-      <w:r>
-        <w:t xml:space="preserve"> </w:t>
-      </w:r>
-      <w:r>
-        <w:t xml:space="preserve">C’est la seule référence que tout le monde à Adjamé et à Treichville comprend immédiatement. Elle vaut mieux que dix minutes d’explication.</w:t>
-      </w:r>
-    </w:p>
-    <w:p>
-      <w:pPr>
-        <w:pStyle w:val="Compact"/>
-        <w:numPr>
-          <w:ilvl w:val="0"/>
-          <w:numId w:val="1005"/>
-        </w:numPr>
-      </w:pPr>
-      <w:r>
-        <w:rPr>
-          <w:b/>
-          <w:bCs/>
-        </w:rPr>
-        <w:t xml:space="preserve">On ne dit pas « je peux vous prendre cinq minutes ? »</w:t>
-      </w:r>
-      <w:r>
-        <w:t xml:space="preserve"> </w:t>
-      </w:r>
-      <w:r>
-        <w:t xml:space="preserve">— c’est une demande de permission qui invite au non. On salue, on se présente, on continue.</w:t>
-      </w:r>
-    </w:p>
-    <w:p>
-      <w:pPr>
-        <w:pStyle w:val="Compact"/>
-        <w:numPr>
-          <w:ilvl w:val="0"/>
-          <w:numId w:val="1005"/>
-        </w:numPr>
-      </w:pPr>
-      <w:r>
-        <w:rPr>
-          <w:b/>
-          <w:bCs/>
-        </w:rPr>
-        <w:t xml:space="preserve">On ne tend rien.</w:t>
-      </w:r>
-      <w:r>
-        <w:t xml:space="preserve"> </w:t>
-      </w:r>
-      <w:r>
-        <w:t xml:space="preserve">Pas de carte, pas de flyer, pas d’écran. Les mains restent libres.</w:t>
-      </w:r>
-    </w:p>
-    <w:p>
-      <w:pPr>
-        <w:pStyle w:val="Compact"/>
-        <w:numPr>
-          <w:ilvl w:val="0"/>
-          <w:numId w:val="1005"/>
-        </w:numPr>
-      </w:pPr>
-      <w:r>
-        <w:rPr>
-          <w:b/>
-          <w:bCs/>
-        </w:rPr>
-        <w:t xml:space="preserve">On ne relève aucune information d’identité en entrant</w:t>
-      </w:r>
-      <w:r>
-        <w:t xml:space="preserve"> </w:t>
-      </w:r>
-      <w:r>
-        <w:t xml:space="preserve">: ni son nom, ni l’enseigne, ni son téléphone, ni sa commune. Un inconnu qui entre et commence par noter qui vous êtes, c’est un contrôleur, pas un partenaire. Tout ça se note</w:t>
-      </w:r>
-      <w:r>
-        <w:t xml:space="preserve"> </w:t>
-      </w:r>
-      <w:r>
-        <w:rPr>
-          <w:b/>
-          <w:bCs/>
-        </w:rPr>
-        <w:t xml:space="preserve">à la toute fin</w:t>
-      </w:r>
-      <w:r>
-        <w:t xml:space="preserve"> </w:t>
-      </w:r>
-      <w:r>
-        <w:t xml:space="preserve">(7, « Le relevé d’identité »). Dans l’app, l’entretien se démarre à blanc : il n’y a rien à saisir avant de parler.</w:t>
-      </w:r>
-    </w:p>
-    <w:p>
-      <w:pPr>
-        <w:pStyle w:val="Compact"/>
-        <w:numPr>
-          <w:ilvl w:val="0"/>
-          <w:numId w:val="1005"/>
-        </w:numPr>
-      </w:pPr>
-      <w:r>
-        <w:rPr>
-          <w:b/>
-          <w:bCs/>
-        </w:rPr>
-        <w:t xml:space="preserve">Si on demande « et ça marche déjà ? » dès la porte</w:t>
-      </w:r>
-      <w:r>
-        <w:t xml:space="preserve">, on répond sans détour et on enchaîne : «</w:t>
-      </w:r>
-      <w:r>
-        <w:t xml:space="preserve"> </w:t>
-      </w:r>
-      <w:r>
-        <w:rPr>
-          <w:b/>
-          <w:bCs/>
-        </w:rPr>
-        <w:t xml:space="preserve">Nous sommes dans la phase de recrutement des vendeurs professionnels</w:t>
-      </w:r>
-      <w:r>
-        <w:t xml:space="preserve"> </w:t>
-      </w:r>
-      <w:r>
-        <w:t xml:space="preserve">— c’est pour ça que je passe vous voir. Ceux qui seront présents au lancement auront un nouveau canal de distribution pour vendre plus. » Puis on bascule en découverte (4.3). Le développement complet est en 6.6.</w:t>
-      </w:r>
-    </w:p>
-    <w:bookmarkEnd w:id="23"/>
-    <w:bookmarkStart w:id="24" w:name="X83021dae1d604d9301e2edae4c6975f0697bd14"/>
-    <w:p>
-      <w:pPr>
-        <w:pStyle w:val="Heading3"/>
-      </w:pPr>
-      <w:r>
-        <w:t xml:space="preserve">4.2 Savoir à qui on parle — avant tout le reste</w:t>
-      </w:r>
-    </w:p>
-    <w:p>
-      <w:pPr>
-        <w:pStyle w:val="FirstParagraph"/>
-      </w:pPr>
-      <w:r>
-        <w:t xml:space="preserve">Immédiatement après l’accroche, une seule question :</w:t>
-      </w:r>
-    </w:p>
-    <w:p>
-      <w:pPr>
-        <w:pStyle w:val="BlockText"/>
-      </w:pPr>
-      <w:r>
-        <w:t xml:space="preserve">« À qui je parle ? »</w:t>
-      </w:r>
-    </w:p>
-    <w:p>
-      <w:pPr>
-        <w:pStyle w:val="FirstParagraph"/>
-      </w:pPr>
-      <w:r>
-        <w:t xml:space="preserve">Puis, selon la réponse :</w:t>
-      </w:r>
-    </w:p>
-    <w:p>
-      <w:pPr>
-        <w:pStyle w:val="BlockText"/>
-      </w:pPr>
-      <w:r>
-        <w:t xml:space="preserve">« C’est vous le propriétaire du magasin ? »</w:t>
-      </w:r>
-    </w:p>
-    <w:p>
-      <w:pPr>
-        <w:pStyle w:val="FirstParagraph"/>
-      </w:pPr>
-      <w:r>
-        <w:rPr>
-          <w:b/>
-          <w:bCs/>
-        </w:rPr>
-        <w:t xml:space="preserve">C’est la question qui décide de la suite de la visite.</w:t>
-      </w:r>
-      <w:r>
-        <w:t xml:space="preserve"> </w:t>
-      </w:r>
-      <w:r>
-        <w:t xml:space="preserve">Une présentation complète faite à quelqu’un qui ne décide pas est une présentation à refaire.</w:t>
+        <w:rPr>
+          <w:b/>
+          <w:bCs/>
+        </w:rPr>
+        <w:t xml:space="preserve">C’est ce qui décide de la suite de la visite.</w:t>
+      </w:r>
+      <w:r>
+        <w:t xml:space="preserve"> </w:t>
+      </w:r>
+      <w:r>
+        <w:t xml:space="preserve">Une présentation complète faite à quelqu’un qui ne décide pas est une présentation à refaire. On ne démarre l’entretien qu’une fois cette réponse obtenue — c’est pour ça que l’app affiche ce rappel sur l’écran « Nouvel entretien », avant le bouton de démarrage, et non dans la trame.</w:t>
       </w:r>
     </w:p>
     <w:tbl>
@@ -1542,6 +1160,382 @@
         </w:tc>
       </w:tr>
     </w:tbl>
+    <w:bookmarkEnd w:id="22"/>
+    <w:bookmarkEnd w:id="23"/>
+    <w:bookmarkStart w:id="32" w:name="X698522ad38752bebab657d2b18e759767239f32"/>
+    <w:p>
+      <w:pPr>
+        <w:pStyle w:val="Heading2"/>
+      </w:pPr>
+      <w:r>
+        <w:t xml:space="preserve">4. Trame d’entretien — ce qu’on dit, mot pour mot</w:t>
+      </w:r>
+    </w:p>
+    <w:p>
+      <w:pPr>
+        <w:pStyle w:val="FirstParagraph"/>
+      </w:pPr>
+      <w:r>
+        <w:t xml:space="preserve">Ce qui suit n’est pas une liste de thèmes à couvrir : ce sont</w:t>
+      </w:r>
+      <w:r>
+        <w:t xml:space="preserve"> </w:t>
+      </w:r>
+      <w:r>
+        <w:rPr>
+          <w:b/>
+          <w:bCs/>
+        </w:rPr>
+        <w:t xml:space="preserve">les phrases telles qu’on les prononce</w:t>
+      </w:r>
+      <w:r>
+        <w:t xml:space="preserve">, dans l’ordre où on les prononce. Les blocs en retrait se disent tels quels. Les tableaux donnent la question à poser à gauche, et à droite ce qu’on écoute dans la réponse.</w:t>
+      </w:r>
+    </w:p>
+    <w:p>
+      <w:pPr>
+        <w:pStyle w:val="BodyText"/>
+      </w:pPr>
+      <w:r>
+        <w:t xml:space="preserve">L’entretien complet tient en</w:t>
+      </w:r>
+      <w:r>
+        <w:t xml:space="preserve"> </w:t>
+      </w:r>
+      <w:r>
+        <w:rPr>
+          <w:b/>
+          <w:bCs/>
+        </w:rPr>
+        <w:t xml:space="preserve">quinze à vingt minutes</w:t>
+      </w:r>
+      <w:r>
+        <w:t xml:space="preserve">, cinq blocs, une vingtaine de questions. On ne les pose jamais toutes : on suit le fil du commerçant, et on note dans la fiche de compte-rendu (section 8).</w:t>
+      </w:r>
+    </w:p>
+    <w:bookmarkStart w:id="24" w:name="laccroche-les-quinze-premières-secondes"/>
+    <w:p>
+      <w:pPr>
+        <w:pStyle w:val="Heading3"/>
+      </w:pPr>
+      <w:r>
+        <w:t xml:space="preserve">4.1 L’accroche — les quinze premières secondes</w:t>
+      </w:r>
+    </w:p>
+    <w:p>
+      <w:pPr>
+        <w:pStyle w:val="FirstParagraph"/>
+      </w:pPr>
+      <w:r>
+        <w:t xml:space="preserve">On entre, on salue, et on dit ceci</w:t>
+      </w:r>
+      <w:r>
+        <w:t xml:space="preserve"> </w:t>
+      </w:r>
+      <w:r>
+        <w:rPr>
+          <w:b/>
+          <w:bCs/>
+        </w:rPr>
+        <w:t xml:space="preserve">debout, sans sortir le téléphone</w:t>
+      </w:r>
+      <w:r>
+        <w:t xml:space="preserve"> </w:t>
+      </w:r>
+      <w:r>
+        <w:t xml:space="preserve">:</w:t>
+      </w:r>
+    </w:p>
+    <w:p>
+      <w:pPr>
+        <w:pStyle w:val="BlockText"/>
+      </w:pPr>
+      <w:r>
+        <w:t xml:space="preserve">« Bonjour Monsieur. / Bonjour Madame.</w:t>
+      </w:r>
+      <w:r>
+        <w:t xml:space="preserve"> </w:t>
+      </w:r>
+      <w:r>
+        <w:t xml:space="preserve">Je suis</w:t>
+      </w:r>
+      <w:r>
+        <w:t xml:space="preserve"> </w:t>
+      </w:r>
+      <w:r>
+        <w:rPr>
+          <w:b/>
+          <w:bCs/>
+        </w:rPr>
+        <w:t xml:space="preserve">Farida</w:t>
+      </w:r>
+      <w:r>
+        <w:t xml:space="preserve">, de</w:t>
+      </w:r>
+      <w:r>
+        <w:t xml:space="preserve"> </w:t>
+      </w:r>
+      <w:r>
+        <w:rPr>
+          <w:b/>
+          <w:bCs/>
+        </w:rPr>
+        <w:t xml:space="preserve">Pièces</w:t>
+      </w:r>
+      <w:r>
+        <w:t xml:space="preserve"> </w:t>
+      </w:r>
+      <w:r>
+        <w:t xml:space="preserve">— pieces.ci.</w:t>
+      </w:r>
+      <w:r>
+        <w:t xml:space="preserve"> </w:t>
+      </w:r>
+      <w:r>
+        <w:t xml:space="preserve">Nous sommes une plateforme qui met en relation les</w:t>
+      </w:r>
+      <w:r>
+        <w:t xml:space="preserve"> </w:t>
+      </w:r>
+      <w:r>
+        <w:rPr>
+          <w:b/>
+          <w:bCs/>
+        </w:rPr>
+        <w:t xml:space="preserve">vendeurs de pièces</w:t>
+      </w:r>
+      <w:r>
+        <w:t xml:space="preserve"> </w:t>
+      </w:r>
+      <w:r>
+        <w:t xml:space="preserve">et les</w:t>
+      </w:r>
+      <w:r>
+        <w:t xml:space="preserve"> </w:t>
+      </w:r>
+      <w:r>
+        <w:rPr>
+          <w:b/>
+          <w:bCs/>
+        </w:rPr>
+        <w:t xml:space="preserve">acheteurs</w:t>
+      </w:r>
+      <w:r>
+        <w:t xml:space="preserve"> </w:t>
+      </w:r>
+      <w:r>
+        <w:t xml:space="preserve">: entreprises, flottes, professionnels et particuliers.</w:t>
+      </w:r>
+      <w:r>
+        <w:t xml:space="preserve"> </w:t>
+      </w:r>
+      <w:r>
+        <w:t xml:space="preserve">Nous sommes</w:t>
+      </w:r>
+      <w:r>
+        <w:t xml:space="preserve"> </w:t>
+      </w:r>
+      <w:r>
+        <w:rPr>
+          <w:b/>
+          <w:bCs/>
+        </w:rPr>
+        <w:t xml:space="preserve">le Jumia des pièces détachées</w:t>
+      </w:r>
+      <w:r>
+        <w:t xml:space="preserve">. »</w:t>
+      </w:r>
+    </w:p>
+    <w:p>
+      <w:pPr>
+        <w:pStyle w:val="FirstParagraph"/>
+      </w:pPr>
+      <w:r>
+        <w:t xml:space="preserve">Puis</w:t>
+      </w:r>
+      <w:r>
+        <w:t xml:space="preserve"> </w:t>
+      </w:r>
+      <w:r>
+        <w:rPr>
+          <w:b/>
+          <w:bCs/>
+        </w:rPr>
+        <w:t xml:space="preserve">on s’arrête</w:t>
+      </w:r>
+      <w:r>
+        <w:t xml:space="preserve">. On laisse la phrase tomber. C’est la seule pause volontaire de tout l’entretien, et elle fait tout le travail : le commerçant comprend en trois secondes qu’on lui amène des acheteurs, et c’est lui qui relance.</w:t>
+      </w:r>
+    </w:p>
+    <w:p>
+      <w:pPr>
+        <w:pStyle w:val="BodyText"/>
+      </w:pPr>
+      <w:r>
+        <w:t xml:space="preserve">Quelques règles sur cette accroche :</w:t>
+      </w:r>
+    </w:p>
+    <w:p>
+      <w:pPr>
+        <w:pStyle w:val="Compact"/>
+        <w:numPr>
+          <w:ilvl w:val="0"/>
+          <w:numId w:val="1005"/>
+        </w:numPr>
+      </w:pPr>
+      <w:r>
+        <w:rPr>
+          <w:b/>
+          <w:bCs/>
+        </w:rPr>
+        <w:t xml:space="preserve">On donne son prénom, pas une fonction.</w:t>
+      </w:r>
+      <w:r>
+        <w:t xml:space="preserve"> </w:t>
+      </w:r>
+      <w:r>
+        <w:t xml:space="preserve">« Farida de Pièces » passe ; « chargée de développement commercial » ferme la porte.</w:t>
+      </w:r>
+    </w:p>
+    <w:p>
+      <w:pPr>
+        <w:pStyle w:val="Compact"/>
+        <w:numPr>
+          <w:ilvl w:val="0"/>
+          <w:numId w:val="1005"/>
+        </w:numPr>
+      </w:pPr>
+      <w:r>
+        <w:rPr>
+          <w:b/>
+          <w:bCs/>
+        </w:rPr>
+        <w:t xml:space="preserve">On dit « Jumia » sans complexe.</w:t>
+      </w:r>
+      <w:r>
+        <w:t xml:space="preserve"> </w:t>
+      </w:r>
+      <w:r>
+        <w:t xml:space="preserve">C’est la seule référence que tout le monde à Adjamé et à Treichville comprend immédiatement. Elle vaut mieux que dix minutes d’explication.</w:t>
+      </w:r>
+    </w:p>
+    <w:p>
+      <w:pPr>
+        <w:pStyle w:val="Compact"/>
+        <w:numPr>
+          <w:ilvl w:val="0"/>
+          <w:numId w:val="1005"/>
+        </w:numPr>
+      </w:pPr>
+      <w:r>
+        <w:rPr>
+          <w:b/>
+          <w:bCs/>
+        </w:rPr>
+        <w:t xml:space="preserve">On ne dit pas « je peux vous prendre cinq minutes ? »</w:t>
+      </w:r>
+      <w:r>
+        <w:t xml:space="preserve"> </w:t>
+      </w:r>
+      <w:r>
+        <w:t xml:space="preserve">— c’est une demande de permission qui invite au non. On salue, on se présente, on continue.</w:t>
+      </w:r>
+    </w:p>
+    <w:p>
+      <w:pPr>
+        <w:pStyle w:val="Compact"/>
+        <w:numPr>
+          <w:ilvl w:val="0"/>
+          <w:numId w:val="1005"/>
+        </w:numPr>
+      </w:pPr>
+      <w:r>
+        <w:rPr>
+          <w:b/>
+          <w:bCs/>
+        </w:rPr>
+        <w:t xml:space="preserve">On ne tend rien.</w:t>
+      </w:r>
+      <w:r>
+        <w:t xml:space="preserve"> </w:t>
+      </w:r>
+      <w:r>
+        <w:t xml:space="preserve">Pas de carte, pas de flyer, pas d’écran. Les mains restent libres.</w:t>
+      </w:r>
+    </w:p>
+    <w:p>
+      <w:pPr>
+        <w:pStyle w:val="Compact"/>
+        <w:numPr>
+          <w:ilvl w:val="0"/>
+          <w:numId w:val="1005"/>
+        </w:numPr>
+      </w:pPr>
+      <w:r>
+        <w:rPr>
+          <w:b/>
+          <w:bCs/>
+        </w:rPr>
+        <w:t xml:space="preserve">On ne relève aucune information d’identité en entrant</w:t>
+      </w:r>
+      <w:r>
+        <w:t xml:space="preserve"> </w:t>
+      </w:r>
+      <w:r>
+        <w:t xml:space="preserve">: ni son nom, ni l’enseigne, ni son téléphone, ni sa commune. Un inconnu qui entre et commence par noter qui vous êtes, c’est un contrôleur, pas un partenaire. Tout ça se note</w:t>
+      </w:r>
+      <w:r>
+        <w:t xml:space="preserve"> </w:t>
+      </w:r>
+      <w:r>
+        <w:rPr>
+          <w:b/>
+          <w:bCs/>
+        </w:rPr>
+        <w:t xml:space="preserve">à la toute fin</w:t>
+      </w:r>
+      <w:r>
+        <w:t xml:space="preserve"> </w:t>
+      </w:r>
+      <w:r>
+        <w:t xml:space="preserve">(7, « Le relevé d’identité »). Dans l’app, l’entretien se démarre à blanc : il n’y a rien à saisir avant de parler.</w:t>
+      </w:r>
+    </w:p>
+    <w:p>
+      <w:pPr>
+        <w:pStyle w:val="Compact"/>
+        <w:numPr>
+          <w:ilvl w:val="0"/>
+          <w:numId w:val="1005"/>
+        </w:numPr>
+      </w:pPr>
+      <w:r>
+        <w:rPr>
+          <w:b/>
+          <w:bCs/>
+        </w:rPr>
+        <w:t xml:space="preserve">Si on demande « et ça marche déjà ? » dès la porte</w:t>
+      </w:r>
+      <w:r>
+        <w:t xml:space="preserve">, on répond sans détour et on enchaîne : «</w:t>
+      </w:r>
+      <w:r>
+        <w:t xml:space="preserve"> </w:t>
+      </w:r>
+      <w:r>
+        <w:rPr>
+          <w:b/>
+          <w:bCs/>
+        </w:rPr>
+        <w:t xml:space="preserve">Nous sommes dans la phase de recrutement des vendeurs professionnels</w:t>
+      </w:r>
+      <w:r>
+        <w:t xml:space="preserve"> </w:t>
+      </w:r>
+      <w:r>
+        <w:t xml:space="preserve">— c’est pour ça que je passe vous voir. Ceux qui seront présents au lancement auront un nouveau canal de distribution pour vendre plus. » Puis on bascule en découverte (4.2). Le développement complet est en 6.6.</w:t>
+      </w:r>
+    </w:p>
     <w:bookmarkEnd w:id="24"/>
     <w:bookmarkStart w:id="25" w:name="la-bascule-vers-la-découverte"/>
     <w:p>
@@ -1549,7 +1543,7 @@
         <w:pStyle w:val="Heading3"/>
       </w:pPr>
       <w:r>
-        <w:t xml:space="preserve">4.3 La bascule vers la découverte</w:t>
+        <w:t xml:space="preserve">4.2 La bascule vers la découverte</w:t>
       </w:r>
     </w:p>
     <w:p>
@@ -1697,7 +1691,7 @@
         <w:pStyle w:val="Heading3"/>
       </w:pPr>
       <w:r>
-        <w:t xml:space="preserve">4.4 Bloc 1 — Le stock, sa profondeur, ce qui dort</w:t>
+        <w:t xml:space="preserve">4.3 Bloc 1 — Le stock, sa profondeur, ce qui dort</w:t>
       </w:r>
     </w:p>
     <w:p>
@@ -1932,7 +1926,7 @@
         <w:pStyle w:val="Heading3"/>
       </w:pPr>
       <w:r>
-        <w:t xml:space="preserve">4.5 Bloc 2 — Marques et références</w:t>
+        <w:t xml:space="preserve">4.4 Bloc 2 — Marques et références</w:t>
       </w:r>
     </w:p>
     <w:p>
@@ -2021,18 +2015,18 @@
               <w:pStyle w:val="Compact"/>
             </w:pPr>
             <w:r>
-              <w:t xml:space="preserve">« Vous vendez de l’origine, de l’adaptable, ou les deux ? »</w:t>
-            </w:r>
-          </w:p>
-        </w:tc>
-        <w:tc>
-          <w:tcPr/>
-          <w:p>
-            <w:pPr>
-              <w:pStyle w:val="Compact"/>
-            </w:pPr>
-            <w:r>
-              <w:t xml:space="preserve">Un vendeur qui assume l’adaptable est un vendeur honnête : c’est bon signe</w:t>
+              <w:t xml:space="preserve">« Vous vendez des pièces du constructeur, OEM, ou les deux ? »</w:t>
+            </w:r>
+          </w:p>
+        </w:tc>
+        <w:tc>
+          <w:tcPr/>
+          <w:p>
+            <w:pPr>
+              <w:pStyle w:val="Compact"/>
+            </w:pPr>
+            <w:r>
+              <w:t xml:space="preserve">Constructeur (à la marque du véhicule) et OEM (le même équipementier, sans la marque) n’ont ni le même prix ni le même acheteur. Un vendeur qui distingue les deux sait ce qu’il vend — et l’annonce sera juste</w:t>
             </w:r>
           </w:p>
         </w:tc>
@@ -2069,7 +2063,7 @@
         <w:pStyle w:val="Heading3"/>
       </w:pPr>
       <w:r>
-        <w:t xml:space="preserve">4.6 Bloc 3 — Comment il suit tout ça</w:t>
+        <w:t xml:space="preserve">4.5 Bloc 3 — Comment il suit tout ça</w:t>
       </w:r>
     </w:p>
     <w:p>
@@ -2134,7 +2128,7 @@
               <w:pStyle w:val="Compact"/>
             </w:pPr>
             <w:r>
-              <w:t xml:space="preserve">« Vous suivez ça dans un cahier, sur un ordinateur, ou c’est de tête ? »</w:t>
+              <w:t xml:space="preserve">« Vous suivez ça comment ? Avec un logiciel, sur Excel, ou sur papier ? »</w:t>
             </w:r>
           </w:p>
         </w:tc>
@@ -2216,7 +2210,7 @@
         <w:pStyle w:val="Heading3"/>
       </w:pPr>
       <w:r>
-        <w:t xml:space="preserve">4.7 Bloc 4 — La livraison</w:t>
+        <w:t xml:space="preserve">4.6 Bloc 4 — La livraison</w:t>
       </w:r>
     </w:p>
     <w:p>
@@ -2377,7 +2371,7 @@
         <w:pStyle w:val="Heading3"/>
       </w:pPr>
       <w:r>
-        <w:t xml:space="preserve">4.8 Bloc 5 — Prix, paiement, et le crédit qui ne rentre pas</w:t>
+        <w:t xml:space="preserve">4.7 Bloc 5 — Prix, paiement, et le crédit qui ne rentre pas</w:t>
       </w:r>
     </w:p>
     <w:p>
@@ -2442,18 +2436,18 @@
               <w:pStyle w:val="Compact"/>
             </w:pPr>
             <w:r>
-              <w:t xml:space="preserve">« Vos prix sont fixes, ou vous négociez au cas par cas ? »</w:t>
-            </w:r>
-          </w:p>
-        </w:tc>
-        <w:tc>
-          <w:tcPr/>
-          <w:p>
-            <w:pPr>
-              <w:pStyle w:val="Compact"/>
-            </w:pPr>
-            <w:r>
-              <w:t xml:space="preserve">Détermine si le prix affiché en ligne sera tenable</w:t>
+              <w:t xml:space="preserve">« Vous pouvez nous donner votre meilleur prix ? On peut négocier ? »</w:t>
+            </w:r>
+          </w:p>
+        </w:tc>
+        <w:tc>
+          <w:tcPr/>
+          <w:p>
+            <w:pPr>
+              <w:pStyle w:val="Compact"/>
+            </w:pPr>
+            <w:r>
+              <w:t xml:space="preserve">On demande d’emblée le prix de gros, pas le prix du comptoir : c’est celui qui sera affiché en ligne. Sa réponse dit aussi s’il négocie au cas par cas, donc si le prix publié sera tenable</w:t>
             </w:r>
           </w:p>
         </w:tc>
@@ -2572,7 +2566,7 @@
         <w:pStyle w:val="Heading3"/>
       </w:pPr>
       <w:r>
-        <w:t xml:space="preserve">4.9 La reformulation — on ferme la découverte avant d’argumenter</w:t>
+        <w:t xml:space="preserve">4.8 La reformulation — on ferme la découverte avant d’argumenter</w:t>
       </w:r>
     </w:p>
     <w:p>
@@ -2714,7 +2708,7 @@
         <w:t xml:space="preserve"> </w:t>
       </w:r>
       <w:r>
-        <w:t xml:space="preserve">de la reformulation (4.9).</w:t>
+        <w:t xml:space="preserve">de la reformulation (4.8).</w:t>
       </w:r>
     </w:p>
     <w:bookmarkStart w:id="33" w:name="dabord-la-promesse-en-entier"/>
@@ -4723,7 +4717,7 @@
           <w:b/>
           <w:bCs/>
         </w:rPr>
-        <w:t xml:space="preserve">Le nom du patron, l’enseigne, le téléphone et la commune se notent à la fin de la visite</w:t>
+        <w:t xml:space="preserve">Le nom du patron, l’enseigne, le téléphone, la commune et le repère d’adresse se notent à la fin de la visite</w:t>
       </w:r>
       <w:r>
         <w:t xml:space="preserve">, une fois le closing fait. C’est l’inverse de ce que fait un démarcheur ordinaire, et c’est volontaire : demander « vous vous appelez comment ? c’est quoi le nom de la boutique ? votre numéro ? »</w:t>
@@ -4788,7 +4782,7 @@
         <w:t xml:space="preserve"> </w:t>
       </w:r>
       <w:r>
-        <w:t xml:space="preserve">L’enseigne est sur la devanture : on la recopie. La commune, on la connaît. On ne demande que le nom et le numéro.</w:t>
+        <w:t xml:space="preserve">L’enseigne est sur la devanture : on la recopie. La commune et le repère (carrefour, pharmacie, station), on les relève soi-même. On ne demande que le nom et le numéro.</w:t>
       </w:r>
     </w:p>
     <w:p>
@@ -4863,7 +4857,10 @@
         <w:t xml:space="preserve">rien à saisir pour démarrer</w:t>
       </w:r>
       <w:r>
-        <w:t xml:space="preserve">. Le bloc « Identité de la boutique » est le dernier de l’entretien, sous la trame, et la clôture reste bloquée tant qu’un nom ou une enseigne n’y est pas renseigné.</w:t>
+        <w:t xml:space="preserve"> </w:t>
+      </w:r>
+      <w:r>
+        <w:t xml:space="preserve">— juste le rappel de seuil à vérifier (parler au patron, ne rien relever tout de suite). Le bloc « Identité de la boutique » est le dernier de l’entretien, sous la trame, et la clôture reste bloquée tant qu’un nom ou une enseigne n’y est pas renseigné.</w:t>
       </w:r>
     </w:p>
     <w:bookmarkEnd w:id="47"/>

</xml_diff>